<commit_message>
feat(document-engine): the four event registers
The registers of accidents and dangerous incidents. The originals are on
Letter paper with doubled borders left over from a web page; each table
is now drawn from a definition, on A4 landscape, with the grouped headings
of the legal form, numbered columns, and blank rows with room to write.
Every register opens on a page of its own.

A table drawn from a definition keeps the size it was given, may run over
pages, and does not repeat a heading that merges cells downwards, which
LibreOffice draws over the rows under it.

Claude-Session: https://claude.ai/code/session_019fFLd3rEWZKkUNU1RuQAwk
</commit_message>
<xml_diff>
--- a/packages/document-engine/templates/12_control_regulation.docx
+++ b/packages/document-engine/templates/12_control_regulation.docx
@@ -1915,9 +1915,7 @@
         <w:gridCol w:w="398"/>
       </w:tblGrid>
       <w:tr>
-        <w:trPr>
-          <w:tblHeader w:val="true"/>
-        </w:trPr>
+        <w:trPr/>
         <w:tc>
           <w:tcPr>
             <w:tcW w:w="467" w:type="dxa"/>
@@ -1944,8 +1942,8 @@
                 <w:color w:val="auto"/>
                 <w:spacing w:val="0"/>
                 <w:w w:val="100"/>
-                <w:sz w:val="20"/>
-                <w:szCs w:val="20"/>
+                <w:sz w:val="16"/>
+                <w:szCs w:val="16"/>
                 <w:lang w:val="ro-RO"/>
               </w:rPr>
             </w:pPr>
@@ -1957,8 +1955,8 @@
                 <w:color w:val="auto"/>
                 <w:spacing w:val="0"/>
                 <w:w w:val="100"/>
-                <w:sz w:val="20"/>
-                <w:szCs w:val="20"/>
+                <w:sz w:val="16"/>
+                <w:szCs w:val="16"/>
                 <w:lang w:val="ro-RO"/>
               </w:rPr>
               <w:t>Nr. crt.</w:t>
@@ -1991,8 +1989,8 @@
                 <w:color w:val="auto"/>
                 <w:spacing w:val="0"/>
                 <w:w w:val="100"/>
-                <w:sz w:val="20"/>
-                <w:szCs w:val="20"/>
+                <w:sz w:val="16"/>
+                <w:szCs w:val="16"/>
                 <w:lang w:val="ro-RO"/>
               </w:rPr>
             </w:pPr>
@@ -2004,8 +2002,8 @@
                 <w:color w:val="auto"/>
                 <w:spacing w:val="0"/>
                 <w:w w:val="100"/>
-                <w:sz w:val="20"/>
-                <w:szCs w:val="20"/>
+                <w:sz w:val="16"/>
+                <w:szCs w:val="16"/>
                 <w:lang w:val="ro-RO"/>
               </w:rPr>
               <w:t>Cine execută controlul intern</w:t>
@@ -2038,8 +2036,8 @@
                 <w:color w:val="auto"/>
                 <w:spacing w:val="0"/>
                 <w:w w:val="100"/>
-                <w:sz w:val="20"/>
-                <w:szCs w:val="20"/>
+                <w:sz w:val="16"/>
+                <w:szCs w:val="16"/>
                 <w:lang w:val="ro-RO"/>
               </w:rPr>
             </w:pPr>
@@ -2051,8 +2049,8 @@
                 <w:color w:val="auto"/>
                 <w:spacing w:val="0"/>
                 <w:w w:val="100"/>
-                <w:sz w:val="20"/>
-                <w:szCs w:val="20"/>
+                <w:sz w:val="16"/>
+                <w:szCs w:val="16"/>
                 <w:lang w:val="ro-RO"/>
               </w:rPr>
               <w:t>Periodicitate control</w:t>
@@ -2085,8 +2083,8 @@
                 <w:color w:val="auto"/>
                 <w:spacing w:val="0"/>
                 <w:w w:val="100"/>
-                <w:sz w:val="20"/>
-                <w:szCs w:val="20"/>
+                <w:sz w:val="16"/>
+                <w:szCs w:val="16"/>
                 <w:lang w:val="ro-RO"/>
               </w:rPr>
             </w:pPr>
@@ -2098,8 +2096,8 @@
                 <w:color w:val="auto"/>
                 <w:spacing w:val="0"/>
                 <w:w w:val="100"/>
-                <w:sz w:val="20"/>
-                <w:szCs w:val="20"/>
+                <w:sz w:val="16"/>
+                <w:szCs w:val="16"/>
                 <w:lang w:val="ro-RO"/>
               </w:rPr>
               <w:t>Sectoare controlate</w:t>
@@ -2133,8 +2131,8 @@
                 <w:color w:val="auto"/>
                 <w:spacing w:val="0"/>
                 <w:w w:val="100"/>
-                <w:sz w:val="20"/>
-                <w:szCs w:val="20"/>
+                <w:sz w:val="16"/>
+                <w:szCs w:val="16"/>
                 <w:lang w:val="ro-RO"/>
               </w:rPr>
             </w:pPr>
@@ -2146,8 +2144,8 @@
                 <w:color w:val="auto"/>
                 <w:spacing w:val="0"/>
                 <w:w w:val="100"/>
-                <w:sz w:val="20"/>
-                <w:szCs w:val="20"/>
+                <w:sz w:val="16"/>
+                <w:szCs w:val="16"/>
                 <w:lang w:val="ro-RO"/>
               </w:rPr>
               <w:t>Lunile anului {{issueYear}}/{{followingYear}}</w:t>
@@ -2361,8 +2359,8 @@
                 <w:color w:val="auto"/>
                 <w:spacing w:val="0"/>
                 <w:w w:val="100"/>
-                <w:sz w:val="20"/>
-                <w:szCs w:val="20"/>
+                <w:sz w:val="16"/>
+                <w:szCs w:val="16"/>
                 <w:lang w:val="ro-RO"/>
               </w:rPr>
             </w:pPr>
@@ -2374,8 +2372,8 @@
                 <w:color w:val="auto"/>
                 <w:spacing w:val="0"/>
                 <w:w w:val="100"/>
-                <w:sz w:val="20"/>
-                <w:szCs w:val="20"/>
+                <w:sz w:val="16"/>
+                <w:szCs w:val="16"/>
                 <w:lang w:val="ro-RO"/>
               </w:rPr>
               <w:t>I</w:t>
@@ -2406,8 +2404,8 @@
                 <w:color w:val="auto"/>
                 <w:spacing w:val="0"/>
                 <w:w w:val="100"/>
-                <w:sz w:val="20"/>
-                <w:szCs w:val="20"/>
+                <w:sz w:val="16"/>
+                <w:szCs w:val="16"/>
                 <w:lang w:val="ro-RO"/>
               </w:rPr>
             </w:pPr>
@@ -2419,8 +2417,8 @@
                 <w:color w:val="auto"/>
                 <w:spacing w:val="0"/>
                 <w:w w:val="100"/>
-                <w:sz w:val="20"/>
-                <w:szCs w:val="20"/>
+                <w:sz w:val="16"/>
+                <w:szCs w:val="16"/>
                 <w:lang w:val="ro-RO"/>
               </w:rPr>
               <w:t>II</w:t>
@@ -2451,8 +2449,8 @@
                 <w:color w:val="auto"/>
                 <w:spacing w:val="0"/>
                 <w:w w:val="100"/>
-                <w:sz w:val="20"/>
-                <w:szCs w:val="20"/>
+                <w:sz w:val="16"/>
+                <w:szCs w:val="16"/>
                 <w:lang w:val="ro-RO"/>
               </w:rPr>
             </w:pPr>
@@ -2464,8 +2462,8 @@
                 <w:color w:val="auto"/>
                 <w:spacing w:val="0"/>
                 <w:w w:val="100"/>
-                <w:sz w:val="20"/>
-                <w:szCs w:val="20"/>
+                <w:sz w:val="16"/>
+                <w:szCs w:val="16"/>
                 <w:lang w:val="ro-RO"/>
               </w:rPr>
               <w:t>III</w:t>
@@ -2496,8 +2494,8 @@
                 <w:color w:val="auto"/>
                 <w:spacing w:val="0"/>
                 <w:w w:val="100"/>
-                <w:sz w:val="20"/>
-                <w:szCs w:val="20"/>
+                <w:sz w:val="16"/>
+                <w:szCs w:val="16"/>
                 <w:lang w:val="ro-RO"/>
               </w:rPr>
             </w:pPr>
@@ -2509,8 +2507,8 @@
                 <w:color w:val="auto"/>
                 <w:spacing w:val="0"/>
                 <w:w w:val="100"/>
-                <w:sz w:val="20"/>
-                <w:szCs w:val="20"/>
+                <w:sz w:val="16"/>
+                <w:szCs w:val="16"/>
                 <w:lang w:val="ro-RO"/>
               </w:rPr>
               <w:t>IV</w:t>
@@ -2541,8 +2539,8 @@
                 <w:color w:val="auto"/>
                 <w:spacing w:val="0"/>
                 <w:w w:val="100"/>
-                <w:sz w:val="20"/>
-                <w:szCs w:val="20"/>
+                <w:sz w:val="16"/>
+                <w:szCs w:val="16"/>
                 <w:lang w:val="ro-RO"/>
               </w:rPr>
             </w:pPr>
@@ -2554,8 +2552,8 @@
                 <w:color w:val="auto"/>
                 <w:spacing w:val="0"/>
                 <w:w w:val="100"/>
-                <w:sz w:val="20"/>
-                <w:szCs w:val="20"/>
+                <w:sz w:val="16"/>
+                <w:szCs w:val="16"/>
                 <w:lang w:val="ro-RO"/>
               </w:rPr>
               <w:t>V</w:t>
@@ -2586,8 +2584,8 @@
                 <w:color w:val="auto"/>
                 <w:spacing w:val="0"/>
                 <w:w w:val="100"/>
-                <w:sz w:val="20"/>
-                <w:szCs w:val="20"/>
+                <w:sz w:val="16"/>
+                <w:szCs w:val="16"/>
                 <w:lang w:val="ro-RO"/>
               </w:rPr>
             </w:pPr>
@@ -2599,8 +2597,8 @@
                 <w:color w:val="auto"/>
                 <w:spacing w:val="0"/>
                 <w:w w:val="100"/>
-                <w:sz w:val="20"/>
-                <w:szCs w:val="20"/>
+                <w:sz w:val="16"/>
+                <w:szCs w:val="16"/>
                 <w:lang w:val="ro-RO"/>
               </w:rPr>
               <w:t>VI</w:t>
@@ -2631,8 +2629,8 @@
                 <w:color w:val="auto"/>
                 <w:spacing w:val="0"/>
                 <w:w w:val="100"/>
-                <w:sz w:val="20"/>
-                <w:szCs w:val="20"/>
+                <w:sz w:val="16"/>
+                <w:szCs w:val="16"/>
                 <w:lang w:val="ro-RO"/>
               </w:rPr>
             </w:pPr>
@@ -2644,8 +2642,8 @@
                 <w:color w:val="auto"/>
                 <w:spacing w:val="0"/>
                 <w:w w:val="100"/>
-                <w:sz w:val="20"/>
-                <w:szCs w:val="20"/>
+                <w:sz w:val="16"/>
+                <w:szCs w:val="16"/>
                 <w:lang w:val="ro-RO"/>
               </w:rPr>
               <w:t>VII</w:t>
@@ -2676,8 +2674,8 @@
                 <w:color w:val="auto"/>
                 <w:spacing w:val="0"/>
                 <w:w w:val="100"/>
-                <w:sz w:val="20"/>
-                <w:szCs w:val="20"/>
+                <w:sz w:val="16"/>
+                <w:szCs w:val="16"/>
                 <w:lang w:val="ro-RO"/>
               </w:rPr>
             </w:pPr>
@@ -2689,8 +2687,8 @@
                 <w:color w:val="auto"/>
                 <w:spacing w:val="0"/>
                 <w:w w:val="100"/>
-                <w:sz w:val="20"/>
-                <w:szCs w:val="20"/>
+                <w:sz w:val="16"/>
+                <w:szCs w:val="16"/>
                 <w:lang w:val="ro-RO"/>
               </w:rPr>
               <w:t>VIII</w:t>
@@ -2721,8 +2719,8 @@
                 <w:color w:val="auto"/>
                 <w:spacing w:val="0"/>
                 <w:w w:val="100"/>
-                <w:sz w:val="20"/>
-                <w:szCs w:val="20"/>
+                <w:sz w:val="16"/>
+                <w:szCs w:val="16"/>
                 <w:lang w:val="ro-RO"/>
               </w:rPr>
             </w:pPr>
@@ -2734,8 +2732,8 @@
                 <w:color w:val="auto"/>
                 <w:spacing w:val="0"/>
                 <w:w w:val="100"/>
-                <w:sz w:val="20"/>
-                <w:szCs w:val="20"/>
+                <w:sz w:val="16"/>
+                <w:szCs w:val="16"/>
                 <w:lang w:val="ro-RO"/>
               </w:rPr>
               <w:t>IX</w:t>
@@ -2766,8 +2764,8 @@
                 <w:color w:val="auto"/>
                 <w:spacing w:val="0"/>
                 <w:w w:val="100"/>
-                <w:sz w:val="20"/>
-                <w:szCs w:val="20"/>
+                <w:sz w:val="16"/>
+                <w:szCs w:val="16"/>
                 <w:lang w:val="ro-RO"/>
               </w:rPr>
             </w:pPr>
@@ -2779,8 +2777,8 @@
                 <w:color w:val="auto"/>
                 <w:spacing w:val="0"/>
                 <w:w w:val="100"/>
-                <w:sz w:val="20"/>
-                <w:szCs w:val="20"/>
+                <w:sz w:val="16"/>
+                <w:szCs w:val="16"/>
                 <w:lang w:val="ro-RO"/>
               </w:rPr>
               <w:t>X</w:t>
@@ -2811,8 +2809,8 @@
                 <w:color w:val="auto"/>
                 <w:spacing w:val="0"/>
                 <w:w w:val="100"/>
-                <w:sz w:val="20"/>
-                <w:szCs w:val="20"/>
+                <w:sz w:val="16"/>
+                <w:szCs w:val="16"/>
                 <w:lang w:val="ro-RO"/>
               </w:rPr>
             </w:pPr>
@@ -2824,8 +2822,8 @@
                 <w:color w:val="auto"/>
                 <w:spacing w:val="0"/>
                 <w:w w:val="100"/>
-                <w:sz w:val="20"/>
-                <w:szCs w:val="20"/>
+                <w:sz w:val="16"/>
+                <w:szCs w:val="16"/>
                 <w:lang w:val="ro-RO"/>
               </w:rPr>
               <w:t>XI</w:t>
@@ -2857,8 +2855,8 @@
                 <w:color w:val="auto"/>
                 <w:spacing w:val="0"/>
                 <w:w w:val="100"/>
-                <w:sz w:val="20"/>
-                <w:szCs w:val="20"/>
+                <w:sz w:val="16"/>
+                <w:szCs w:val="16"/>
                 <w:lang w:val="ro-RO"/>
               </w:rPr>
             </w:pPr>
@@ -2870,8 +2868,8 @@
                 <w:color w:val="auto"/>
                 <w:spacing w:val="0"/>
                 <w:w w:val="100"/>
-                <w:sz w:val="20"/>
-                <w:szCs w:val="20"/>
+                <w:sz w:val="16"/>
+                <w:szCs w:val="16"/>
                 <w:lang w:val="ro-RO"/>
               </w:rPr>
               <w:t>XII</w:t>
@@ -2905,8 +2903,8 @@
                 <w:color w:val="auto"/>
                 <w:spacing w:val="0"/>
                 <w:w w:val="100"/>
-                <w:sz w:val="20"/>
-                <w:szCs w:val="20"/>
+                <w:sz w:val="16"/>
+                <w:szCs w:val="16"/>
                 <w:lang w:val="ro-RO"/>
               </w:rPr>
             </w:pPr>
@@ -2918,8 +2916,8 @@
                 <w:color w:val="auto"/>
                 <w:spacing w:val="0"/>
                 <w:w w:val="100"/>
-                <w:sz w:val="20"/>
-                <w:szCs w:val="20"/>
+                <w:sz w:val="16"/>
+                <w:szCs w:val="16"/>
                 <w:lang w:val="ro-RO"/>
               </w:rPr>
               <w:t>1.</w:t>
@@ -2950,8 +2948,8 @@
                 <w:color w:val="auto"/>
                 <w:spacing w:val="0"/>
                 <w:w w:val="100"/>
-                <w:sz w:val="20"/>
-                <w:szCs w:val="20"/>
+                <w:sz w:val="16"/>
+                <w:szCs w:val="16"/>
                 <w:lang w:val="ro-RO"/>
               </w:rPr>
             </w:pPr>
@@ -2963,8 +2961,8 @@
                 <w:color w:val="auto"/>
                 <w:spacing w:val="0"/>
                 <w:w w:val="100"/>
-                <w:sz w:val="20"/>
-                <w:szCs w:val="20"/>
+                <w:sz w:val="16"/>
+                <w:szCs w:val="16"/>
                 <w:lang w:val="ro-RO"/>
               </w:rPr>
               <w:t>Angajator</w:t>
@@ -2995,8 +2993,8 @@
                 <w:color w:val="auto"/>
                 <w:spacing w:val="0"/>
                 <w:w w:val="100"/>
-                <w:sz w:val="20"/>
-                <w:szCs w:val="20"/>
+                <w:sz w:val="16"/>
+                <w:szCs w:val="16"/>
                 <w:lang w:val="ro-RO"/>
               </w:rPr>
             </w:pPr>
@@ -3008,8 +3006,8 @@
                 <w:color w:val="auto"/>
                 <w:spacing w:val="0"/>
                 <w:w w:val="100"/>
-                <w:sz w:val="20"/>
-                <w:szCs w:val="20"/>
+                <w:sz w:val="16"/>
+                <w:szCs w:val="16"/>
                 <w:lang w:val="ro-RO"/>
               </w:rPr>
               <w:t>Anual</w:t>
@@ -3040,8 +3038,8 @@
                 <w:color w:val="auto"/>
                 <w:spacing w:val="0"/>
                 <w:w w:val="100"/>
-                <w:sz w:val="20"/>
-                <w:szCs w:val="20"/>
+                <w:sz w:val="16"/>
+                <w:szCs w:val="16"/>
                 <w:lang w:val="ro-RO"/>
               </w:rPr>
             </w:pPr>
@@ -3053,8 +3051,8 @@
                 <w:color w:val="auto"/>
                 <w:spacing w:val="0"/>
                 <w:w w:val="100"/>
-                <w:sz w:val="20"/>
-                <w:szCs w:val="20"/>
+                <w:sz w:val="16"/>
+                <w:szCs w:val="16"/>
                 <w:lang w:val="ro-RO"/>
               </w:rPr>
               <w:t>Întreaga unitate</w:t>
@@ -3085,8 +3083,8 @@
                 <w:color w:val="auto"/>
                 <w:spacing w:val="0"/>
                 <w:w w:val="100"/>
-                <w:sz w:val="20"/>
-                <w:szCs w:val="20"/>
+                <w:sz w:val="16"/>
+                <w:szCs w:val="16"/>
                 <w:lang w:val="ro-RO"/>
               </w:rPr>
             </w:pPr>
@@ -3098,8 +3096,8 @@
                 <w:color w:val="auto"/>
                 <w:spacing w:val="0"/>
                 <w:w w:val="100"/>
-                <w:sz w:val="20"/>
-                <w:szCs w:val="20"/>
+                <w:sz w:val="16"/>
+                <w:szCs w:val="16"/>
                 <w:lang w:val="ro-RO"/>
               </w:rPr>
               <w:t>-</w:t>
@@ -3130,8 +3128,8 @@
                 <w:color w:val="auto"/>
                 <w:spacing w:val="0"/>
                 <w:w w:val="100"/>
-                <w:sz w:val="20"/>
-                <w:szCs w:val="20"/>
+                <w:sz w:val="16"/>
+                <w:szCs w:val="16"/>
                 <w:lang w:val="ro-RO"/>
               </w:rPr>
             </w:pPr>
@@ -3143,8 +3141,8 @@
                 <w:color w:val="auto"/>
                 <w:spacing w:val="0"/>
                 <w:w w:val="100"/>
-                <w:sz w:val="20"/>
-                <w:szCs w:val="20"/>
+                <w:sz w:val="16"/>
+                <w:szCs w:val="16"/>
                 <w:lang w:val="ro-RO"/>
               </w:rPr>
               <w:t>-</w:t>
@@ -3175,8 +3173,8 @@
                 <w:color w:val="auto"/>
                 <w:spacing w:val="0"/>
                 <w:w w:val="100"/>
-                <w:sz w:val="20"/>
-                <w:szCs w:val="20"/>
+                <w:sz w:val="16"/>
+                <w:szCs w:val="16"/>
                 <w:lang w:val="ro-RO"/>
               </w:rPr>
             </w:pPr>
@@ -3188,8 +3186,8 @@
                 <w:color w:val="auto"/>
                 <w:spacing w:val="0"/>
                 <w:w w:val="100"/>
-                <w:sz w:val="20"/>
-                <w:szCs w:val="20"/>
+                <w:sz w:val="16"/>
+                <w:szCs w:val="16"/>
                 <w:lang w:val="ro-RO"/>
               </w:rPr>
               <w:t>-</w:t>
@@ -3220,8 +3218,8 @@
                 <w:color w:val="auto"/>
                 <w:spacing w:val="0"/>
                 <w:w w:val="100"/>
-                <w:sz w:val="20"/>
-                <w:szCs w:val="20"/>
+                <w:sz w:val="16"/>
+                <w:szCs w:val="16"/>
                 <w:lang w:val="ro-RO"/>
               </w:rPr>
             </w:pPr>
@@ -3233,8 +3231,8 @@
                 <w:color w:val="auto"/>
                 <w:spacing w:val="0"/>
                 <w:w w:val="100"/>
-                <w:sz w:val="20"/>
-                <w:szCs w:val="20"/>
+                <w:sz w:val="16"/>
+                <w:szCs w:val="16"/>
                 <w:lang w:val="ro-RO"/>
               </w:rPr>
               <w:t>-</w:t>
@@ -3265,8 +3263,8 @@
                 <w:color w:val="auto"/>
                 <w:spacing w:val="0"/>
                 <w:w w:val="100"/>
-                <w:sz w:val="20"/>
-                <w:szCs w:val="20"/>
+                <w:sz w:val="16"/>
+                <w:szCs w:val="16"/>
                 <w:lang w:val="ro-RO"/>
               </w:rPr>
             </w:pPr>
@@ -3278,8 +3276,8 @@
                 <w:color w:val="auto"/>
                 <w:spacing w:val="0"/>
                 <w:w w:val="100"/>
-                <w:sz w:val="20"/>
-                <w:szCs w:val="20"/>
+                <w:sz w:val="16"/>
+                <w:szCs w:val="16"/>
                 <w:lang w:val="ro-RO"/>
               </w:rPr>
               <w:t>-</w:t>
@@ -3310,8 +3308,8 @@
                 <w:color w:val="auto"/>
                 <w:spacing w:val="0"/>
                 <w:w w:val="100"/>
-                <w:sz w:val="20"/>
-                <w:szCs w:val="20"/>
+                <w:sz w:val="16"/>
+                <w:szCs w:val="16"/>
                 <w:lang w:val="ro-RO"/>
               </w:rPr>
             </w:pPr>
@@ -3323,8 +3321,8 @@
                 <w:color w:val="auto"/>
                 <w:spacing w:val="0"/>
                 <w:w w:val="100"/>
-                <w:sz w:val="20"/>
-                <w:szCs w:val="20"/>
+                <w:sz w:val="16"/>
+                <w:szCs w:val="16"/>
                 <w:lang w:val="ro-RO"/>
               </w:rPr>
               <w:t>-</w:t>
@@ -3355,8 +3353,8 @@
                 <w:color w:val="auto"/>
                 <w:spacing w:val="0"/>
                 <w:w w:val="100"/>
-                <w:sz w:val="20"/>
-                <w:szCs w:val="20"/>
+                <w:sz w:val="16"/>
+                <w:szCs w:val="16"/>
                 <w:lang w:val="ro-RO"/>
               </w:rPr>
             </w:pPr>
@@ -3368,8 +3366,8 @@
                 <w:color w:val="auto"/>
                 <w:spacing w:val="0"/>
                 <w:w w:val="100"/>
-                <w:sz w:val="20"/>
-                <w:szCs w:val="20"/>
+                <w:sz w:val="16"/>
+                <w:szCs w:val="16"/>
                 <w:lang w:val="ro-RO"/>
               </w:rPr>
               <w:t>-</w:t>
@@ -3400,8 +3398,8 @@
                 <w:color w:val="auto"/>
                 <w:spacing w:val="0"/>
                 <w:w w:val="100"/>
-                <w:sz w:val="20"/>
-                <w:szCs w:val="20"/>
+                <w:sz w:val="16"/>
+                <w:szCs w:val="16"/>
                 <w:lang w:val="ro-RO"/>
               </w:rPr>
             </w:pPr>
@@ -3413,8 +3411,8 @@
                 <w:color w:val="auto"/>
                 <w:spacing w:val="0"/>
                 <w:w w:val="100"/>
-                <w:sz w:val="20"/>
-                <w:szCs w:val="20"/>
+                <w:sz w:val="16"/>
+                <w:szCs w:val="16"/>
                 <w:lang w:val="ro-RO"/>
               </w:rPr>
               <w:t>-</w:t>
@@ -3445,8 +3443,8 @@
                 <w:color w:val="auto"/>
                 <w:spacing w:val="0"/>
                 <w:w w:val="100"/>
-                <w:sz w:val="20"/>
-                <w:szCs w:val="20"/>
+                <w:sz w:val="16"/>
+                <w:szCs w:val="16"/>
                 <w:lang w:val="ro-RO"/>
               </w:rPr>
             </w:pPr>
@@ -3458,8 +3456,8 @@
                 <w:color w:val="auto"/>
                 <w:spacing w:val="0"/>
                 <w:w w:val="100"/>
-                <w:sz w:val="20"/>
-                <w:szCs w:val="20"/>
+                <w:sz w:val="16"/>
+                <w:szCs w:val="16"/>
                 <w:lang w:val="ro-RO"/>
               </w:rPr>
               <w:t>-</w:t>
@@ -3490,8 +3488,8 @@
                 <w:color w:val="auto"/>
                 <w:spacing w:val="0"/>
                 <w:w w:val="100"/>
-                <w:sz w:val="20"/>
-                <w:szCs w:val="20"/>
+                <w:sz w:val="16"/>
+                <w:szCs w:val="16"/>
                 <w:lang w:val="ro-RO"/>
               </w:rPr>
             </w:pPr>
@@ -3503,8 +3501,8 @@
                 <w:color w:val="auto"/>
                 <w:spacing w:val="0"/>
                 <w:w w:val="100"/>
-                <w:sz w:val="20"/>
-                <w:szCs w:val="20"/>
+                <w:sz w:val="16"/>
+                <w:szCs w:val="16"/>
                 <w:lang w:val="ro-RO"/>
               </w:rPr>
               <w:t>-</w:t>
@@ -3535,8 +3533,8 @@
                 <w:color w:val="auto"/>
                 <w:spacing w:val="0"/>
                 <w:w w:val="100"/>
-                <w:sz w:val="20"/>
-                <w:szCs w:val="20"/>
+                <w:sz w:val="16"/>
+                <w:szCs w:val="16"/>
                 <w:lang w:val="ro-RO"/>
               </w:rPr>
             </w:pPr>
@@ -3548,8 +3546,8 @@
                 <w:color w:val="auto"/>
                 <w:spacing w:val="0"/>
                 <w:w w:val="100"/>
-                <w:sz w:val="20"/>
-                <w:szCs w:val="20"/>
+                <w:sz w:val="16"/>
+                <w:szCs w:val="16"/>
                 <w:lang w:val="ro-RO"/>
               </w:rPr>
               <w:t>-</w:t>
@@ -3581,8 +3579,8 @@
                 <w:color w:val="auto"/>
                 <w:spacing w:val="0"/>
                 <w:w w:val="100"/>
-                <w:sz w:val="20"/>
-                <w:szCs w:val="20"/>
+                <w:sz w:val="16"/>
+                <w:szCs w:val="16"/>
                 <w:lang w:val="ro-RO"/>
               </w:rPr>
             </w:pPr>
@@ -3594,8 +3592,8 @@
                 <w:color w:val="auto"/>
                 <w:spacing w:val="0"/>
                 <w:w w:val="100"/>
-                <w:sz w:val="20"/>
-                <w:szCs w:val="20"/>
+                <w:sz w:val="16"/>
+                <w:szCs w:val="16"/>
                 <w:lang w:val="ro-RO"/>
               </w:rPr>
               <w:t>x</w:t>
@@ -3629,8 +3627,8 @@
                 <w:color w:val="auto"/>
                 <w:spacing w:val="0"/>
                 <w:w w:val="100"/>
-                <w:sz w:val="20"/>
-                <w:szCs w:val="20"/>
+                <w:sz w:val="16"/>
+                <w:szCs w:val="16"/>
                 <w:lang w:val="ro-RO"/>
               </w:rPr>
             </w:pPr>
@@ -3642,8 +3640,8 @@
                 <w:color w:val="auto"/>
                 <w:spacing w:val="0"/>
                 <w:w w:val="100"/>
-                <w:sz w:val="20"/>
-                <w:szCs w:val="20"/>
+                <w:sz w:val="16"/>
+                <w:szCs w:val="16"/>
                 <w:lang w:val="ro-RO"/>
               </w:rPr>
               <w:t>2.</w:t>
@@ -3674,8 +3672,8 @@
                 <w:color w:val="auto"/>
                 <w:spacing w:val="0"/>
                 <w:w w:val="100"/>
-                <w:sz w:val="20"/>
-                <w:szCs w:val="20"/>
+                <w:sz w:val="16"/>
+                <w:szCs w:val="16"/>
                 <w:lang w:val="ro-RO"/>
               </w:rPr>
             </w:pPr>
@@ -3687,8 +3685,8 @@
                 <w:color w:val="auto"/>
                 <w:spacing w:val="0"/>
                 <w:w w:val="100"/>
-                <w:sz w:val="20"/>
-                <w:szCs w:val="20"/>
+                <w:sz w:val="16"/>
+                <w:szCs w:val="16"/>
                 <w:lang w:val="ro-RO"/>
               </w:rPr>
               <w:t>Serviciul extern de prevenire și protecție</w:t>
@@ -3719,8 +3717,8 @@
                 <w:color w:val="auto"/>
                 <w:spacing w:val="0"/>
                 <w:w w:val="100"/>
-                <w:sz w:val="20"/>
-                <w:szCs w:val="20"/>
+                <w:sz w:val="16"/>
+                <w:szCs w:val="16"/>
                 <w:lang w:val="ro-RO"/>
               </w:rPr>
             </w:pPr>
@@ -3732,8 +3730,8 @@
                 <w:color w:val="auto"/>
                 <w:spacing w:val="0"/>
                 <w:w w:val="100"/>
-                <w:sz w:val="20"/>
-                <w:szCs w:val="20"/>
+                <w:sz w:val="16"/>
+                <w:szCs w:val="16"/>
                 <w:lang w:val="ro-RO"/>
               </w:rPr>
               <w:t>Trimestrial</w:t>
@@ -3764,8 +3762,8 @@
                 <w:color w:val="auto"/>
                 <w:spacing w:val="0"/>
                 <w:w w:val="100"/>
-                <w:sz w:val="20"/>
-                <w:szCs w:val="20"/>
+                <w:sz w:val="16"/>
+                <w:szCs w:val="16"/>
                 <w:lang w:val="ro-RO"/>
               </w:rPr>
             </w:pPr>
@@ -3777,8 +3775,8 @@
                 <w:color w:val="auto"/>
                 <w:spacing w:val="0"/>
                 <w:w w:val="100"/>
-                <w:sz w:val="20"/>
-                <w:szCs w:val="20"/>
+                <w:sz w:val="16"/>
+                <w:szCs w:val="16"/>
                 <w:lang w:val="ro-RO"/>
               </w:rPr>
               <w:t>Întreaga unitate</w:t>
@@ -3809,8 +3807,8 @@
                 <w:color w:val="auto"/>
                 <w:spacing w:val="0"/>
                 <w:w w:val="100"/>
-                <w:sz w:val="20"/>
-                <w:szCs w:val="20"/>
+                <w:sz w:val="16"/>
+                <w:szCs w:val="16"/>
                 <w:lang w:val="ro-RO"/>
               </w:rPr>
             </w:pPr>
@@ -3822,8 +3820,8 @@
                 <w:color w:val="auto"/>
                 <w:spacing w:val="0"/>
                 <w:w w:val="100"/>
-                <w:sz w:val="20"/>
-                <w:szCs w:val="20"/>
+                <w:sz w:val="16"/>
+                <w:szCs w:val="16"/>
                 <w:lang w:val="ro-RO"/>
               </w:rPr>
               <w:t>-</w:t>
@@ -3854,8 +3852,8 @@
                 <w:color w:val="auto"/>
                 <w:spacing w:val="0"/>
                 <w:w w:val="100"/>
-                <w:sz w:val="20"/>
-                <w:szCs w:val="20"/>
+                <w:sz w:val="16"/>
+                <w:szCs w:val="16"/>
                 <w:lang w:val="ro-RO"/>
               </w:rPr>
             </w:pPr>
@@ -3867,8 +3865,8 @@
                 <w:color w:val="auto"/>
                 <w:spacing w:val="0"/>
                 <w:w w:val="100"/>
-                <w:sz w:val="20"/>
-                <w:szCs w:val="20"/>
+                <w:sz w:val="16"/>
+                <w:szCs w:val="16"/>
                 <w:lang w:val="ro-RO"/>
               </w:rPr>
               <w:t>-</w:t>
@@ -3899,8 +3897,8 @@
                 <w:color w:val="auto"/>
                 <w:spacing w:val="0"/>
                 <w:w w:val="100"/>
-                <w:sz w:val="20"/>
-                <w:szCs w:val="20"/>
+                <w:sz w:val="16"/>
+                <w:szCs w:val="16"/>
                 <w:lang w:val="ro-RO"/>
               </w:rPr>
             </w:pPr>
@@ -3912,8 +3910,8 @@
                 <w:color w:val="auto"/>
                 <w:spacing w:val="0"/>
                 <w:w w:val="100"/>
-                <w:sz w:val="20"/>
-                <w:szCs w:val="20"/>
+                <w:sz w:val="16"/>
+                <w:szCs w:val="16"/>
                 <w:lang w:val="ro-RO"/>
               </w:rPr>
               <w:t>x</w:t>
@@ -3944,8 +3942,8 @@
                 <w:color w:val="auto"/>
                 <w:spacing w:val="0"/>
                 <w:w w:val="100"/>
-                <w:sz w:val="20"/>
-                <w:szCs w:val="20"/>
+                <w:sz w:val="16"/>
+                <w:szCs w:val="16"/>
                 <w:lang w:val="ro-RO"/>
               </w:rPr>
             </w:pPr>
@@ -3957,8 +3955,8 @@
                 <w:color w:val="auto"/>
                 <w:spacing w:val="0"/>
                 <w:w w:val="100"/>
-                <w:sz w:val="20"/>
-                <w:szCs w:val="20"/>
+                <w:sz w:val="16"/>
+                <w:szCs w:val="16"/>
                 <w:lang w:val="ro-RO"/>
               </w:rPr>
               <w:t>-</w:t>
@@ -3989,8 +3987,8 @@
                 <w:color w:val="auto"/>
                 <w:spacing w:val="0"/>
                 <w:w w:val="100"/>
-                <w:sz w:val="20"/>
-                <w:szCs w:val="20"/>
+                <w:sz w:val="16"/>
+                <w:szCs w:val="16"/>
                 <w:lang w:val="ro-RO"/>
               </w:rPr>
             </w:pPr>
@@ -4002,8 +4000,8 @@
                 <w:color w:val="auto"/>
                 <w:spacing w:val="0"/>
                 <w:w w:val="100"/>
-                <w:sz w:val="20"/>
-                <w:szCs w:val="20"/>
+                <w:sz w:val="16"/>
+                <w:szCs w:val="16"/>
                 <w:lang w:val="ro-RO"/>
               </w:rPr>
               <w:t>-</w:t>
@@ -4034,8 +4032,8 @@
                 <w:color w:val="auto"/>
                 <w:spacing w:val="0"/>
                 <w:w w:val="100"/>
-                <w:sz w:val="20"/>
-                <w:szCs w:val="20"/>
+                <w:sz w:val="16"/>
+                <w:szCs w:val="16"/>
                 <w:lang w:val="ro-RO"/>
               </w:rPr>
             </w:pPr>
@@ -4047,8 +4045,8 @@
                 <w:color w:val="auto"/>
                 <w:spacing w:val="0"/>
                 <w:w w:val="100"/>
-                <w:sz w:val="20"/>
-                <w:szCs w:val="20"/>
+                <w:sz w:val="16"/>
+                <w:szCs w:val="16"/>
                 <w:lang w:val="ro-RO"/>
               </w:rPr>
               <w:t>x</w:t>
@@ -4079,8 +4077,8 @@
                 <w:color w:val="auto"/>
                 <w:spacing w:val="0"/>
                 <w:w w:val="100"/>
-                <w:sz w:val="20"/>
-                <w:szCs w:val="20"/>
+                <w:sz w:val="16"/>
+                <w:szCs w:val="16"/>
                 <w:lang w:val="ro-RO"/>
               </w:rPr>
             </w:pPr>
@@ -4092,8 +4090,8 @@
                 <w:color w:val="auto"/>
                 <w:spacing w:val="0"/>
                 <w:w w:val="100"/>
-                <w:sz w:val="20"/>
-                <w:szCs w:val="20"/>
+                <w:sz w:val="16"/>
+                <w:szCs w:val="16"/>
                 <w:lang w:val="ro-RO"/>
               </w:rPr>
               <w:t>-</w:t>
@@ -4124,8 +4122,8 @@
                 <w:color w:val="auto"/>
                 <w:spacing w:val="0"/>
                 <w:w w:val="100"/>
-                <w:sz w:val="20"/>
-                <w:szCs w:val="20"/>
+                <w:sz w:val="16"/>
+                <w:szCs w:val="16"/>
                 <w:lang w:val="ro-RO"/>
               </w:rPr>
             </w:pPr>
@@ -4137,8 +4135,8 @@
                 <w:color w:val="auto"/>
                 <w:spacing w:val="0"/>
                 <w:w w:val="100"/>
-                <w:sz w:val="20"/>
-                <w:szCs w:val="20"/>
+                <w:sz w:val="16"/>
+                <w:szCs w:val="16"/>
                 <w:lang w:val="ro-RO"/>
               </w:rPr>
               <w:t>-</w:t>
@@ -4169,8 +4167,8 @@
                 <w:color w:val="auto"/>
                 <w:spacing w:val="0"/>
                 <w:w w:val="100"/>
-                <w:sz w:val="20"/>
-                <w:szCs w:val="20"/>
+                <w:sz w:val="16"/>
+                <w:szCs w:val="16"/>
                 <w:lang w:val="ro-RO"/>
               </w:rPr>
             </w:pPr>
@@ -4182,8 +4180,8 @@
                 <w:color w:val="auto"/>
                 <w:spacing w:val="0"/>
                 <w:w w:val="100"/>
-                <w:sz w:val="20"/>
-                <w:szCs w:val="20"/>
+                <w:sz w:val="16"/>
+                <w:szCs w:val="16"/>
                 <w:lang w:val="ro-RO"/>
               </w:rPr>
               <w:t>x</w:t>
@@ -4214,8 +4212,8 @@
                 <w:color w:val="auto"/>
                 <w:spacing w:val="0"/>
                 <w:w w:val="100"/>
-                <w:sz w:val="20"/>
-                <w:szCs w:val="20"/>
+                <w:sz w:val="16"/>
+                <w:szCs w:val="16"/>
                 <w:lang w:val="ro-RO"/>
               </w:rPr>
             </w:pPr>
@@ -4227,8 +4225,8 @@
                 <w:color w:val="auto"/>
                 <w:spacing w:val="0"/>
                 <w:w w:val="100"/>
-                <w:sz w:val="20"/>
-                <w:szCs w:val="20"/>
+                <w:sz w:val="16"/>
+                <w:szCs w:val="16"/>
                 <w:lang w:val="ro-RO"/>
               </w:rPr>
               <w:t>-</w:t>
@@ -4259,8 +4257,8 @@
                 <w:color w:val="auto"/>
                 <w:spacing w:val="0"/>
                 <w:w w:val="100"/>
-                <w:sz w:val="20"/>
-                <w:szCs w:val="20"/>
+                <w:sz w:val="16"/>
+                <w:szCs w:val="16"/>
                 <w:lang w:val="ro-RO"/>
               </w:rPr>
             </w:pPr>
@@ -4272,8 +4270,8 @@
                 <w:color w:val="auto"/>
                 <w:spacing w:val="0"/>
                 <w:w w:val="100"/>
-                <w:sz w:val="20"/>
-                <w:szCs w:val="20"/>
+                <w:sz w:val="16"/>
+                <w:szCs w:val="16"/>
                 <w:lang w:val="ro-RO"/>
               </w:rPr>
               <w:t>-</w:t>
@@ -4305,8 +4303,8 @@
                 <w:color w:val="auto"/>
                 <w:spacing w:val="0"/>
                 <w:w w:val="100"/>
-                <w:sz w:val="20"/>
-                <w:szCs w:val="20"/>
+                <w:sz w:val="16"/>
+                <w:szCs w:val="16"/>
                 <w:lang w:val="ro-RO"/>
               </w:rPr>
             </w:pPr>
@@ -4318,8 +4316,8 @@
                 <w:color w:val="auto"/>
                 <w:spacing w:val="0"/>
                 <w:w w:val="100"/>
-                <w:sz w:val="20"/>
-                <w:szCs w:val="20"/>
+                <w:sz w:val="16"/>
+                <w:szCs w:val="16"/>
                 <w:lang w:val="ro-RO"/>
               </w:rPr>
               <w:t>x</w:t>
@@ -4353,8 +4351,8 @@
                 <w:color w:val="auto"/>
                 <w:spacing w:val="0"/>
                 <w:w w:val="100"/>
-                <w:sz w:val="20"/>
-                <w:szCs w:val="20"/>
+                <w:sz w:val="16"/>
+                <w:szCs w:val="16"/>
                 <w:lang w:val="ro-RO"/>
               </w:rPr>
             </w:pPr>
@@ -4366,8 +4364,8 @@
                 <w:color w:val="auto"/>
                 <w:spacing w:val="0"/>
                 <w:w w:val="100"/>
-                <w:sz w:val="20"/>
-                <w:szCs w:val="20"/>
+                <w:sz w:val="16"/>
+                <w:szCs w:val="16"/>
                 <w:lang w:val="ro-RO"/>
               </w:rPr>
               <w:t>3.</w:t>
@@ -4398,8 +4396,8 @@
                 <w:color w:val="auto"/>
                 <w:spacing w:val="0"/>
                 <w:w w:val="100"/>
-                <w:sz w:val="20"/>
-                <w:szCs w:val="20"/>
+                <w:sz w:val="16"/>
+                <w:szCs w:val="16"/>
                 <w:lang w:val="ro-RO"/>
               </w:rPr>
             </w:pPr>
@@ -4411,8 +4409,8 @@
                 <w:color w:val="auto"/>
                 <w:spacing w:val="0"/>
                 <w:w w:val="100"/>
-                <w:sz w:val="20"/>
-                <w:szCs w:val="20"/>
+                <w:sz w:val="16"/>
+                <w:szCs w:val="16"/>
                 <w:lang w:val="ro-RO"/>
               </w:rPr>
               <w:t>Șefii locurilor de muncă</w:t>
@@ -4443,8 +4441,8 @@
                 <w:color w:val="auto"/>
                 <w:spacing w:val="0"/>
                 <w:w w:val="100"/>
-                <w:sz w:val="20"/>
-                <w:szCs w:val="20"/>
+                <w:sz w:val="16"/>
+                <w:szCs w:val="16"/>
                 <w:lang w:val="ro-RO"/>
               </w:rPr>
             </w:pPr>
@@ -4456,8 +4454,8 @@
                 <w:color w:val="auto"/>
                 <w:spacing w:val="0"/>
                 <w:w w:val="100"/>
-                <w:sz w:val="20"/>
-                <w:szCs w:val="20"/>
+                <w:sz w:val="16"/>
+                <w:szCs w:val="16"/>
                 <w:lang w:val="ro-RO"/>
               </w:rPr>
               <w:t>Săptămânal</w:t>
@@ -4488,8 +4486,8 @@
                 <w:color w:val="auto"/>
                 <w:spacing w:val="0"/>
                 <w:w w:val="100"/>
-                <w:sz w:val="20"/>
-                <w:szCs w:val="20"/>
+                <w:sz w:val="16"/>
+                <w:szCs w:val="16"/>
                 <w:lang w:val="ro-RO"/>
               </w:rPr>
             </w:pPr>
@@ -4501,8 +4499,8 @@
                 <w:color w:val="auto"/>
                 <w:spacing w:val="0"/>
                 <w:w w:val="100"/>
-                <w:sz w:val="20"/>
-                <w:szCs w:val="20"/>
+                <w:sz w:val="16"/>
+                <w:szCs w:val="16"/>
                 <w:lang w:val="ro-RO"/>
               </w:rPr>
               <w:t>Locul de muncă</w:t>
@@ -4533,8 +4531,8 @@
                 <w:color w:val="auto"/>
                 <w:spacing w:val="0"/>
                 <w:w w:val="100"/>
-                <w:sz w:val="20"/>
-                <w:szCs w:val="20"/>
+                <w:sz w:val="16"/>
+                <w:szCs w:val="16"/>
                 <w:lang w:val="ro-RO"/>
               </w:rPr>
             </w:pPr>
@@ -4546,8 +4544,8 @@
                 <w:color w:val="auto"/>
                 <w:spacing w:val="0"/>
                 <w:w w:val="100"/>
-                <w:sz w:val="20"/>
-                <w:szCs w:val="20"/>
+                <w:sz w:val="16"/>
+                <w:szCs w:val="16"/>
                 <w:lang w:val="ro-RO"/>
               </w:rPr>
               <w:t>xx</w:t>
@@ -4568,8 +4566,8 @@
                 <w:color w:val="auto"/>
                 <w:spacing w:val="0"/>
                 <w:w w:val="100"/>
-                <w:sz w:val="20"/>
-                <w:szCs w:val="20"/>
+                <w:sz w:val="16"/>
+                <w:szCs w:val="16"/>
                 <w:lang w:val="ro-RO"/>
               </w:rPr>
             </w:pPr>
@@ -4581,8 +4579,8 @@
                 <w:color w:val="auto"/>
                 <w:spacing w:val="0"/>
                 <w:w w:val="100"/>
-                <w:sz w:val="20"/>
-                <w:szCs w:val="20"/>
+                <w:sz w:val="16"/>
+                <w:szCs w:val="16"/>
                 <w:lang w:val="ro-RO"/>
               </w:rPr>
               <w:t>xx</w:t>
@@ -4613,8 +4611,8 @@
                 <w:color w:val="auto"/>
                 <w:spacing w:val="0"/>
                 <w:w w:val="100"/>
-                <w:sz w:val="20"/>
-                <w:szCs w:val="20"/>
+                <w:sz w:val="16"/>
+                <w:szCs w:val="16"/>
                 <w:lang w:val="ro-RO"/>
               </w:rPr>
             </w:pPr>
@@ -4626,8 +4624,8 @@
                 <w:color w:val="auto"/>
                 <w:spacing w:val="0"/>
                 <w:w w:val="100"/>
-                <w:sz w:val="20"/>
-                <w:szCs w:val="20"/>
+                <w:sz w:val="16"/>
+                <w:szCs w:val="16"/>
                 <w:lang w:val="ro-RO"/>
               </w:rPr>
               <w:t>xx</w:t>
@@ -4648,8 +4646,8 @@
                 <w:color w:val="auto"/>
                 <w:spacing w:val="0"/>
                 <w:w w:val="100"/>
-                <w:sz w:val="20"/>
-                <w:szCs w:val="20"/>
+                <w:sz w:val="16"/>
+                <w:szCs w:val="16"/>
                 <w:lang w:val="ro-RO"/>
               </w:rPr>
             </w:pPr>
@@ -4661,8 +4659,8 @@
                 <w:color w:val="auto"/>
                 <w:spacing w:val="0"/>
                 <w:w w:val="100"/>
-                <w:sz w:val="20"/>
-                <w:szCs w:val="20"/>
+                <w:sz w:val="16"/>
+                <w:szCs w:val="16"/>
                 <w:lang w:val="ro-RO"/>
               </w:rPr>
               <w:t>xx</w:t>
@@ -4693,8 +4691,8 @@
                 <w:color w:val="auto"/>
                 <w:spacing w:val="0"/>
                 <w:w w:val="100"/>
-                <w:sz w:val="20"/>
-                <w:szCs w:val="20"/>
+                <w:sz w:val="16"/>
+                <w:szCs w:val="16"/>
                 <w:lang w:val="ro-RO"/>
               </w:rPr>
             </w:pPr>
@@ -4706,8 +4704,8 @@
                 <w:color w:val="auto"/>
                 <w:spacing w:val="0"/>
                 <w:w w:val="100"/>
-                <w:sz w:val="20"/>
-                <w:szCs w:val="20"/>
+                <w:sz w:val="16"/>
+                <w:szCs w:val="16"/>
                 <w:lang w:val="ro-RO"/>
               </w:rPr>
               <w:t>xx</w:t>
@@ -4728,8 +4726,8 @@
                 <w:color w:val="auto"/>
                 <w:spacing w:val="0"/>
                 <w:w w:val="100"/>
-                <w:sz w:val="20"/>
-                <w:szCs w:val="20"/>
+                <w:sz w:val="16"/>
+                <w:szCs w:val="16"/>
                 <w:lang w:val="ro-RO"/>
               </w:rPr>
             </w:pPr>
@@ -4741,8 +4739,8 @@
                 <w:color w:val="auto"/>
                 <w:spacing w:val="0"/>
                 <w:w w:val="100"/>
-                <w:sz w:val="20"/>
-                <w:szCs w:val="20"/>
+                <w:sz w:val="16"/>
+                <w:szCs w:val="16"/>
                 <w:lang w:val="ro-RO"/>
               </w:rPr>
               <w:t>xx</w:t>
@@ -4773,8 +4771,8 @@
                 <w:color w:val="auto"/>
                 <w:spacing w:val="0"/>
                 <w:w w:val="100"/>
-                <w:sz w:val="20"/>
-                <w:szCs w:val="20"/>
+                <w:sz w:val="16"/>
+                <w:szCs w:val="16"/>
                 <w:lang w:val="ro-RO"/>
               </w:rPr>
             </w:pPr>
@@ -4786,8 +4784,8 @@
                 <w:color w:val="auto"/>
                 <w:spacing w:val="0"/>
                 <w:w w:val="100"/>
-                <w:sz w:val="20"/>
-                <w:szCs w:val="20"/>
+                <w:sz w:val="16"/>
+                <w:szCs w:val="16"/>
                 <w:lang w:val="ro-RO"/>
               </w:rPr>
               <w:t>xx</w:t>
@@ -4808,8 +4806,8 @@
                 <w:color w:val="auto"/>
                 <w:spacing w:val="0"/>
                 <w:w w:val="100"/>
-                <w:sz w:val="20"/>
-                <w:szCs w:val="20"/>
+                <w:sz w:val="16"/>
+                <w:szCs w:val="16"/>
                 <w:lang w:val="ro-RO"/>
               </w:rPr>
             </w:pPr>
@@ -4821,8 +4819,8 @@
                 <w:color w:val="auto"/>
                 <w:spacing w:val="0"/>
                 <w:w w:val="100"/>
-                <w:sz w:val="20"/>
-                <w:szCs w:val="20"/>
+                <w:sz w:val="16"/>
+                <w:szCs w:val="16"/>
                 <w:lang w:val="ro-RO"/>
               </w:rPr>
               <w:t>xx</w:t>
@@ -4853,8 +4851,8 @@
                 <w:color w:val="auto"/>
                 <w:spacing w:val="0"/>
                 <w:w w:val="100"/>
-                <w:sz w:val="20"/>
-                <w:szCs w:val="20"/>
+                <w:sz w:val="16"/>
+                <w:szCs w:val="16"/>
                 <w:lang w:val="ro-RO"/>
               </w:rPr>
             </w:pPr>
@@ -4866,8 +4864,8 @@
                 <w:color w:val="auto"/>
                 <w:spacing w:val="0"/>
                 <w:w w:val="100"/>
-                <w:sz w:val="20"/>
-                <w:szCs w:val="20"/>
+                <w:sz w:val="16"/>
+                <w:szCs w:val="16"/>
                 <w:lang w:val="ro-RO"/>
               </w:rPr>
               <w:t>xx</w:t>
@@ -4888,8 +4886,8 @@
                 <w:color w:val="auto"/>
                 <w:spacing w:val="0"/>
                 <w:w w:val="100"/>
-                <w:sz w:val="20"/>
-                <w:szCs w:val="20"/>
+                <w:sz w:val="16"/>
+                <w:szCs w:val="16"/>
                 <w:lang w:val="ro-RO"/>
               </w:rPr>
             </w:pPr>
@@ -4901,8 +4899,8 @@
                 <w:color w:val="auto"/>
                 <w:spacing w:val="0"/>
                 <w:w w:val="100"/>
-                <w:sz w:val="20"/>
-                <w:szCs w:val="20"/>
+                <w:sz w:val="16"/>
+                <w:szCs w:val="16"/>
                 <w:lang w:val="ro-RO"/>
               </w:rPr>
               <w:t>xx</w:t>
@@ -4933,8 +4931,8 @@
                 <w:color w:val="auto"/>
                 <w:spacing w:val="0"/>
                 <w:w w:val="100"/>
-                <w:sz w:val="20"/>
-                <w:szCs w:val="20"/>
+                <w:sz w:val="16"/>
+                <w:szCs w:val="16"/>
                 <w:lang w:val="ro-RO"/>
               </w:rPr>
             </w:pPr>
@@ -4946,8 +4944,8 @@
                 <w:color w:val="auto"/>
                 <w:spacing w:val="0"/>
                 <w:w w:val="100"/>
-                <w:sz w:val="20"/>
-                <w:szCs w:val="20"/>
+                <w:sz w:val="16"/>
+                <w:szCs w:val="16"/>
                 <w:lang w:val="ro-RO"/>
               </w:rPr>
               <w:t>xx</w:t>
@@ -4968,8 +4966,8 @@
                 <w:color w:val="auto"/>
                 <w:spacing w:val="0"/>
                 <w:w w:val="100"/>
-                <w:sz w:val="20"/>
-                <w:szCs w:val="20"/>
+                <w:sz w:val="16"/>
+                <w:szCs w:val="16"/>
                 <w:lang w:val="ro-RO"/>
               </w:rPr>
             </w:pPr>
@@ -4981,8 +4979,8 @@
                 <w:color w:val="auto"/>
                 <w:spacing w:val="0"/>
                 <w:w w:val="100"/>
-                <w:sz w:val="20"/>
-                <w:szCs w:val="20"/>
+                <w:sz w:val="16"/>
+                <w:szCs w:val="16"/>
                 <w:lang w:val="ro-RO"/>
               </w:rPr>
               <w:t>xx</w:t>
@@ -5013,8 +5011,8 @@
                 <w:color w:val="auto"/>
                 <w:spacing w:val="0"/>
                 <w:w w:val="100"/>
-                <w:sz w:val="20"/>
-                <w:szCs w:val="20"/>
+                <w:sz w:val="16"/>
+                <w:szCs w:val="16"/>
                 <w:lang w:val="ro-RO"/>
               </w:rPr>
             </w:pPr>
@@ -5026,8 +5024,8 @@
                 <w:color w:val="auto"/>
                 <w:spacing w:val="0"/>
                 <w:w w:val="100"/>
-                <w:sz w:val="20"/>
-                <w:szCs w:val="20"/>
+                <w:sz w:val="16"/>
+                <w:szCs w:val="16"/>
                 <w:lang w:val="ro-RO"/>
               </w:rPr>
               <w:t>xx</w:t>
@@ -5048,8 +5046,8 @@
                 <w:color w:val="auto"/>
                 <w:spacing w:val="0"/>
                 <w:w w:val="100"/>
-                <w:sz w:val="20"/>
-                <w:szCs w:val="20"/>
+                <w:sz w:val="16"/>
+                <w:szCs w:val="16"/>
                 <w:lang w:val="ro-RO"/>
               </w:rPr>
             </w:pPr>
@@ -5061,8 +5059,8 @@
                 <w:color w:val="auto"/>
                 <w:spacing w:val="0"/>
                 <w:w w:val="100"/>
-                <w:sz w:val="20"/>
-                <w:szCs w:val="20"/>
+                <w:sz w:val="16"/>
+                <w:szCs w:val="16"/>
                 <w:lang w:val="ro-RO"/>
               </w:rPr>
               <w:t>xx</w:t>
@@ -5093,8 +5091,8 @@
                 <w:color w:val="auto"/>
                 <w:spacing w:val="0"/>
                 <w:w w:val="100"/>
-                <w:sz w:val="20"/>
-                <w:szCs w:val="20"/>
+                <w:sz w:val="16"/>
+                <w:szCs w:val="16"/>
                 <w:lang w:val="ro-RO"/>
               </w:rPr>
             </w:pPr>
@@ -5106,8 +5104,8 @@
                 <w:color w:val="auto"/>
                 <w:spacing w:val="0"/>
                 <w:w w:val="100"/>
-                <w:sz w:val="20"/>
-                <w:szCs w:val="20"/>
+                <w:sz w:val="16"/>
+                <w:szCs w:val="16"/>
                 <w:lang w:val="ro-RO"/>
               </w:rPr>
               <w:t>xx</w:t>
@@ -5128,8 +5126,8 @@
                 <w:color w:val="auto"/>
                 <w:spacing w:val="0"/>
                 <w:w w:val="100"/>
-                <w:sz w:val="20"/>
-                <w:szCs w:val="20"/>
+                <w:sz w:val="16"/>
+                <w:szCs w:val="16"/>
                 <w:lang w:val="ro-RO"/>
               </w:rPr>
             </w:pPr>
@@ -5141,8 +5139,8 @@
                 <w:color w:val="auto"/>
                 <w:spacing w:val="0"/>
                 <w:w w:val="100"/>
-                <w:sz w:val="20"/>
-                <w:szCs w:val="20"/>
+                <w:sz w:val="16"/>
+                <w:szCs w:val="16"/>
                 <w:lang w:val="ro-RO"/>
               </w:rPr>
               <w:t>xx</w:t>
@@ -5173,8 +5171,8 @@
                 <w:color w:val="auto"/>
                 <w:spacing w:val="0"/>
                 <w:w w:val="100"/>
-                <w:sz w:val="20"/>
-                <w:szCs w:val="20"/>
+                <w:sz w:val="16"/>
+                <w:szCs w:val="16"/>
                 <w:lang w:val="ro-RO"/>
               </w:rPr>
             </w:pPr>
@@ -5186,8 +5184,8 @@
                 <w:color w:val="auto"/>
                 <w:spacing w:val="0"/>
                 <w:w w:val="100"/>
-                <w:sz w:val="20"/>
-                <w:szCs w:val="20"/>
+                <w:sz w:val="16"/>
+                <w:szCs w:val="16"/>
                 <w:lang w:val="ro-RO"/>
               </w:rPr>
               <w:t>xx</w:t>
@@ -5208,8 +5206,8 @@
                 <w:color w:val="auto"/>
                 <w:spacing w:val="0"/>
                 <w:w w:val="100"/>
-                <w:sz w:val="20"/>
-                <w:szCs w:val="20"/>
+                <w:sz w:val="16"/>
+                <w:szCs w:val="16"/>
                 <w:lang w:val="ro-RO"/>
               </w:rPr>
             </w:pPr>
@@ -5221,8 +5219,8 @@
                 <w:color w:val="auto"/>
                 <w:spacing w:val="0"/>
                 <w:w w:val="100"/>
-                <w:sz w:val="20"/>
-                <w:szCs w:val="20"/>
+                <w:sz w:val="16"/>
+                <w:szCs w:val="16"/>
                 <w:lang w:val="ro-RO"/>
               </w:rPr>
               <w:t>xx</w:t>
@@ -5253,8 +5251,8 @@
                 <w:color w:val="auto"/>
                 <w:spacing w:val="0"/>
                 <w:w w:val="100"/>
-                <w:sz w:val="20"/>
-                <w:szCs w:val="20"/>
+                <w:sz w:val="16"/>
+                <w:szCs w:val="16"/>
                 <w:lang w:val="ro-RO"/>
               </w:rPr>
             </w:pPr>
@@ -5266,8 +5264,8 @@
                 <w:color w:val="auto"/>
                 <w:spacing w:val="0"/>
                 <w:w w:val="100"/>
-                <w:sz w:val="20"/>
-                <w:szCs w:val="20"/>
+                <w:sz w:val="16"/>
+                <w:szCs w:val="16"/>
                 <w:lang w:val="ro-RO"/>
               </w:rPr>
               <w:t>xx</w:t>
@@ -5288,8 +5286,8 @@
                 <w:color w:val="auto"/>
                 <w:spacing w:val="0"/>
                 <w:w w:val="100"/>
-                <w:sz w:val="20"/>
-                <w:szCs w:val="20"/>
+                <w:sz w:val="16"/>
+                <w:szCs w:val="16"/>
                 <w:lang w:val="ro-RO"/>
               </w:rPr>
             </w:pPr>
@@ -5301,8 +5299,8 @@
                 <w:color w:val="auto"/>
                 <w:spacing w:val="0"/>
                 <w:w w:val="100"/>
-                <w:sz w:val="20"/>
-                <w:szCs w:val="20"/>
+                <w:sz w:val="16"/>
+                <w:szCs w:val="16"/>
                 <w:lang w:val="ro-RO"/>
               </w:rPr>
               <w:t>xx</w:t>
@@ -5333,8 +5331,8 @@
                 <w:color w:val="auto"/>
                 <w:spacing w:val="0"/>
                 <w:w w:val="100"/>
-                <w:sz w:val="20"/>
-                <w:szCs w:val="20"/>
+                <w:sz w:val="16"/>
+                <w:szCs w:val="16"/>
                 <w:lang w:val="ro-RO"/>
               </w:rPr>
             </w:pPr>
@@ -5346,8 +5344,8 @@
                 <w:color w:val="auto"/>
                 <w:spacing w:val="0"/>
                 <w:w w:val="100"/>
-                <w:sz w:val="20"/>
-                <w:szCs w:val="20"/>
+                <w:sz w:val="16"/>
+                <w:szCs w:val="16"/>
                 <w:lang w:val="ro-RO"/>
               </w:rPr>
               <w:t>xx</w:t>
@@ -5368,8 +5366,8 @@
                 <w:color w:val="auto"/>
                 <w:spacing w:val="0"/>
                 <w:w w:val="100"/>
-                <w:sz w:val="20"/>
-                <w:szCs w:val="20"/>
+                <w:sz w:val="16"/>
+                <w:szCs w:val="16"/>
                 <w:lang w:val="ro-RO"/>
               </w:rPr>
             </w:pPr>
@@ -5381,8 +5379,8 @@
                 <w:color w:val="auto"/>
                 <w:spacing w:val="0"/>
                 <w:w w:val="100"/>
-                <w:sz w:val="20"/>
-                <w:szCs w:val="20"/>
+                <w:sz w:val="16"/>
+                <w:szCs w:val="16"/>
                 <w:lang w:val="ro-RO"/>
               </w:rPr>
               <w:t>xx</w:t>
@@ -5414,8 +5412,8 @@
                 <w:color w:val="auto"/>
                 <w:spacing w:val="0"/>
                 <w:w w:val="100"/>
-                <w:sz w:val="20"/>
-                <w:szCs w:val="20"/>
+                <w:sz w:val="16"/>
+                <w:szCs w:val="16"/>
                 <w:lang w:val="ro-RO"/>
               </w:rPr>
             </w:pPr>
@@ -5427,8 +5425,8 @@
                 <w:color w:val="auto"/>
                 <w:spacing w:val="0"/>
                 <w:w w:val="100"/>
-                <w:sz w:val="20"/>
-                <w:szCs w:val="20"/>
+                <w:sz w:val="16"/>
+                <w:szCs w:val="16"/>
                 <w:lang w:val="ro-RO"/>
               </w:rPr>
               <w:t>xx</w:t>
@@ -5449,8 +5447,8 @@
                 <w:color w:val="auto"/>
                 <w:spacing w:val="0"/>
                 <w:w w:val="100"/>
-                <w:sz w:val="20"/>
-                <w:szCs w:val="20"/>
+                <w:sz w:val="16"/>
+                <w:szCs w:val="16"/>
                 <w:lang w:val="ro-RO"/>
               </w:rPr>
             </w:pPr>
@@ -5462,8 +5460,8 @@
                 <w:color w:val="auto"/>
                 <w:spacing w:val="0"/>
                 <w:w w:val="100"/>
-                <w:sz w:val="20"/>
-                <w:szCs w:val="20"/>
+                <w:sz w:val="16"/>
+                <w:szCs w:val="16"/>
                 <w:lang w:val="ro-RO"/>
               </w:rPr>
               <w:t>xx</w:t>

</xml_diff>

<commit_message>
fix(templates): the control regulation holds with or without a committee or an internal service
Arts 18 and 21 have the quarterly analysis done by the safety committee where
one is set up, or by the employer. Arts 2, 6, 8, 9, 10, 12, 14, 16 and 17 name
"serviciul intern sau extern de prevenire și protecție", the pair of H.G.
1425/2006, since these clients are served by an external service.

Claude-Session: https://claude.ai/code/session_01A9qjCHVH6kcDAEKFiJoShR
</commit_message>
<xml_diff>
--- a/packages/document-engine/templates/12_control_regulation.docx
+++ b/packages/document-engine/templates/12_control_regulation.docx
@@ -441,7 +441,7 @@
           <w:szCs w:val="20"/>
           <w:lang w:val="ro-RO"/>
         </w:rPr>
-        <w:t>Serviciul intern de prevenire și protecție împreună cu serviciul extern de prevenire și protecție întocmește anual un grafic pentru efectuarea controlului de către structurile cu atribuții de prevenire și protecție și șefii locurilor de muncă pentru prevenirea accidentelor de muncă și a bolilor profesionale.</w:t>
+        <w:t xml:space="preserve">Serviciul intern sau extern de prevenire și protecție întocmește anual un grafic pentru efectuarea controlului de către structurile cu atribuții de prevenire și protecție și șefii locurilor de muncă pentru prevenirea accidentelor de muncă și a bolilor profesionale.</w:t>
       </w:r>
     </w:p>
     <w:p>
@@ -639,7 +639,7 @@
           <w:szCs w:val="20"/>
           <w:lang w:val="ro-RO"/>
         </w:rPr>
-        <w:t>Controalele interne efectuate de către Serviciul intern de prevenire și protecție, prin lucrătorul desemnat și Serviciul extern de prevenire și protecție se finalizează printr-un proces-verbal de control sau referat în care se consemnează următoarele:</w:t>
+        <w:t xml:space="preserve">Controalele interne efectuate de către serviciul intern sau extern de prevenire și protecție se finalizează printr-un proces-verbal de control sau referat în care se consemnează următoarele:</w:t>
       </w:r>
     </w:p>
     <w:p>
@@ -951,7 +951,7 @@
           <w:szCs w:val="20"/>
           <w:lang w:val="ro-RO"/>
         </w:rPr>
-        <w:t>Constatările de insecuritate sau neconformitate făcute de șefii locurilor de muncă se aduc la cunoștința serviciului intern de prevenire și protecție, șefului direct și dacă este cazul departamentului de întreținere.</w:t>
+        <w:t xml:space="preserve">Constatările de insecuritate sau neconformitate făcute de șefii locurilor de muncă se aduc la cunoștința serviciului intern sau extern de prevenire și protecție, șefului direct și dacă este cazul departamentului de întreținere.</w:t>
       </w:r>
     </w:p>
     <w:p>
@@ -979,7 +979,7 @@
           <w:szCs w:val="20"/>
           <w:lang w:val="ro-RO"/>
         </w:rPr>
-        <w:t xml:space="preserve">Constatările de insecuritate sau neconformitate făcute de șefii locurilor de muncă, centralizate de serviciul intern de prevenire și protecție, vor fi prezentate periodic (lunar sau trimestrial) în sinteza Directorului General și în funcție de importanța încălcării, imediat ce ia la cunoștință despre aceasta.</w:t>
+        <w:t xml:space="preserve">Constatările de insecuritate sau neconformitate făcute de șefii locurilor de muncă, centralizate de serviciul intern sau extern de prevenire și protecție, vor fi prezentate periodic (lunar sau trimestrial) în sinteza Directorului General și în funcție de importanța încălcării, imediat ce ia la cunoștință despre aceasta.</w:t>
       </w:r>
     </w:p>
     <w:p>
@@ -1007,7 +1007,7 @@
           <w:szCs w:val="20"/>
           <w:lang w:val="ro-RO"/>
         </w:rPr>
-        <w:t>Propuneri de sancțiuni și stimulente pentru lucrători pe criteriul îndeplinirii atribuțiilor în domeniul securității și sănătății în muncă. Aceste propuneri vor fi efectuate de către șeful ierarhic superior, către serviciul intern de prevenire și protecție și în ultimă instanță către angajator.</w:t>
+        <w:t xml:space="preserve">Propuneri de sancțiuni și stimulente pentru lucrători pe criteriul îndeplinirii atribuțiilor în domeniul securității și sănătății în muncă. Aceste propuneri vor fi efectuate de către șeful ierarhic superior, către serviciul intern sau extern de prevenire și protecție și în ultimă instanță către angajator.</w:t>
       </w:r>
     </w:p>
     <w:p>
@@ -1063,7 +1063,7 @@
           <w:szCs w:val="20"/>
           <w:lang w:val="ro-RO"/>
         </w:rPr>
-        <w:t xml:space="preserve">Constatările de insecuritate ale echipamentelor de muncă din dotare vor fi transmise de urgență către șeful ierarhic superior, către departamentul tehnic sau către serviciul intern de prevenire și protecție.</w:t>
+        <w:t xml:space="preserve">Constatările de insecuritate ale echipamentelor de muncă din dotare vor fi transmise de urgență către șeful ierarhic superior, către departamentul tehnic sau către serviciul intern sau extern de prevenire și protecție.</w:t>
       </w:r>
     </w:p>
     <w:p>
@@ -1119,7 +1119,7 @@
           <w:szCs w:val="20"/>
           <w:lang w:val="ro-RO"/>
         </w:rPr>
-        <w:t xml:space="preserve">Constatările privind lipsa, deteriorarea sau necesitatea de noi mijloace de semnalizare vor fi transmise de urgență către șeful ierarhic superior și către serviciul intern de prevenire.</w:t>
+        <w:t xml:space="preserve">Constatările privind lipsa, deteriorarea sau necesitatea de noi mijloace de semnalizare vor fi transmise de urgență către șeful ierarhic superior și către serviciul intern sau extern de prevenire și protecție.</w:t>
       </w:r>
     </w:p>
     <w:p>
@@ -1176,7 +1176,7 @@
           <w:szCs w:val="20"/>
           <w:lang w:val="ro-RO"/>
         </w:rPr>
-        <w:t>Serviciul intern de prevenire și protecție va efectua următoarele activități de verificare și control:</w:t>
+        <w:t xml:space="preserve">Serviciul intern sau extern de prevenire și protecție va efectua următoarele activități de verificare și control:</w:t>
       </w:r>
     </w:p>
     <w:p>
@@ -1484,7 +1484,7 @@
           <w:szCs w:val="20"/>
           <w:lang w:val="ro-RO"/>
         </w:rPr>
-        <w:t>Serviciul intern de prevenire și protecție centralizează constatările șefilor locurilor de muncă.</w:t>
+        <w:t xml:space="preserve">Serviciul intern sau extern de prevenire și protecție centralizează constatările șefilor locurilor de muncă.</w:t>
       </w:r>
     </w:p>
     <w:p>
@@ -1512,7 +1512,7 @@
           <w:szCs w:val="20"/>
           <w:lang w:val="ro-RO"/>
         </w:rPr>
-        <w:t>Trimestrial, în cadrul ședinței Comitetului de securitate și sănătate în muncă, se analizează activitatea de prevenire și protecție și rezultatul controalelor efectuate de către structurile cu atribuții de prevenire și protecție.</w:t>
+        <w:t xml:space="preserve">Trimestrial, activitatea de prevenire și protecție și rezultatul controalelor efectuate de către structurile cu atribuții de prevenire și protecție se analizează în cadrul ședinței Comitetului de securitate și sănătate în muncă, acolo unde acesta este constituit, sau de către angajator.</w:t>
       </w:r>
     </w:p>
     <w:p>
@@ -1877,7 +1877,7 @@
           <w:szCs w:val="20"/>
           <w:lang w:val="ro-RO"/>
         </w:rPr>
-        <w:t>Neconformitățile constatate vor fi analizate în cadrul ședințelor Comitetului de securitate și sănătate în muncă, iar măsurile de prevenire și protecție vor fi hotărâte prin consultare cu membrii Comitetului de securitate și sănătate în muncă și șefii locurilor de muncă și de către Directorul General.</w:t>
+        <w:t xml:space="preserve">Neconformitățile constatate vor fi analizate în cadrul ședințelor Comitetului de securitate și sănătate în muncă, acolo unde acesta este constituit, sau de către angajator, iar măsurile de prevenire și protecție vor fi hotărâte de către Directorul General, prin consultare cu membrii Comitetului de securitate și sănătate în muncă, acolo unde acesta este constituit, și cu șefii locurilor de muncă.</w:t>
       </w:r>
     </w:p>
     <w:p>

</xml_diff>

<commit_message>
fix(templates): agreement and commas in the control regulation
Art. 1: "punctele 5, 17 și 29". Art. 3: "se înțeleg lucrătorii desemnați și serviciul
extern". Art. 8: "șefului direct și, dacă este cazul, departamentului de întreținere".
Art. 5 and Tabel 1 are untouched.

Claude-Session: https://claude.ai/code/session_01A9qjCHVH6kcDAEKFiJoShR
</commit_message>
<xml_diff>
--- a/packages/document-engine/templates/12_control_regulation.docx
+++ b/packages/document-engine/templates/12_control_regulation.docx
@@ -389,7 +389,7 @@
           <w:szCs w:val="20"/>
           <w:lang w:val="ro-RO"/>
         </w:rPr>
-        <w:t xml:space="preserve">În baza prevederilor Legii 319/ 2006, Art. 13, lit. f) și a prevederilor H.G. 1425/ 2006, Art. 15, alin. (1), punctul 5, 17 și 29 se reglementează controlul propriu al respectării </w:t>
+        <w:t xml:space="preserve">În baza prevederilor Legii 319/ 2006, Art. 13, lit. f) și a prevederilor H.G. 1425/ 2006, Art. 15, alin. (1), punctele 5, 17 și 29 se reglementează controlul propriu al respectării </w:t>
       </w:r>
       <w:r>
         <w:rPr>
@@ -469,7 +469,7 @@
           <w:szCs w:val="20"/>
           <w:lang w:val="ro-RO"/>
         </w:rPr>
-        <w:t>Prin structuri cu atribuții de prevenire și protecție se înțelege lucrători desemnați și serviciu extern de prevenire și protecție.</w:t>
+        <w:t xml:space="preserve">Prin structuri cu atribuții de prevenire și protecție se înțeleg lucrătorii desemnați și serviciul extern de prevenire și protecție.</w:t>
       </w:r>
     </w:p>
     <w:p>
@@ -951,7 +951,7 @@
           <w:szCs w:val="20"/>
           <w:lang w:val="ro-RO"/>
         </w:rPr>
-        <w:t xml:space="preserve">Constatările de insecuritate sau neconformitate făcute de șefii locurilor de muncă se aduc la cunoștința serviciului intern sau extern de prevenire și protecție, șefului direct și dacă este cazul departamentului de întreținere.</w:t>
+        <w:t xml:space="preserve">Constatările de insecuritate sau neconformitate făcute de șefii locurilor de muncă se aduc la cunoștința serviciului intern sau extern de prevenire și protecție, șefului direct și, dacă este cazul, departamentului de întreținere.</w:t>
       </w:r>
     </w:p>
     <w:p>

</xml_diff>

<commit_message>
fix(templates): the control regulation's Art. 5 keeps the intervals of its own table
The external service controls at most every 3 months and the workplace managers weekly, as Tabel 1
schedules them (Trimestrial, Săptămânal), instead of every 30 days and daily.

Claude-Session: https://claude.ai/code/session_01A9qjCHVH6kcDAEKFiJoShR
</commit_message>
<xml_diff>
--- a/packages/document-engine/templates/12_control_regulation.docx
+++ b/packages/document-engine/templates/12_control_regulation.docx
@@ -554,7 +554,7 @@
           <w:szCs w:val="20"/>
           <w:lang w:val="ro-RO"/>
         </w:rPr>
-        <w:t>Serviciul extern de prevenire și protecție va efectua controale interne ori de câte ori consideră necesară efectuarea unui control intern, dar perioada de timp între două controale nu va depăși 30 de zile calendaristice;</w:t>
+        <w:t xml:space="preserve">Serviciul extern de prevenire și protecție va efectua controale interne ori de câte ori consideră necesară efectuarea unui control intern, dar perioada de timp între două controale nu va depăși 3 luni;</w:t>
       </w:r>
     </w:p>
     <w:p>
@@ -610,7 +610,7 @@
           <w:szCs w:val="20"/>
           <w:lang w:val="ro-RO"/>
         </w:rPr>
-        <w:t>șefii locurilor de muncă vor efectua controale interne zilnice vizuale la locurile de muncă pe care le conduc și în zona în care își desfășoară activitatea și vor transmite neregulile constatate către șeful ierarhic superior și / sau responsabilului de securitate și sănătate în muncă.</w:t>
+        <w:t xml:space="preserve">șefii locurilor de muncă vor efectua controale interne săptămânale vizuale la locurile de muncă pe care le conduc și în zona în care își desfășoară activitatea și vor transmite neregulile constatate către șeful ierarhic superior și / sau responsabilului de securitate și sănătate în muncă.</w:t>
       </w:r>
     </w:p>
     <w:p>

</xml_diff>

<commit_message>
fix(templates): the control regulation reports to the employer, not a Director General
Art. 9 presents the centralised findings to the employer in a summary, and immediately once the
breach is known ("ia cunoștință de aceasta"); Art. 21 has the employer decide the measures.

Claude-Session: https://claude.ai/code/session_01A9qjCHVH6kcDAEKFiJoShR
</commit_message>
<xml_diff>
--- a/packages/document-engine/templates/12_control_regulation.docx
+++ b/packages/document-engine/templates/12_control_regulation.docx
@@ -979,7 +979,7 @@
           <w:szCs w:val="20"/>
           <w:lang w:val="ro-RO"/>
         </w:rPr>
-        <w:t xml:space="preserve">Constatările de insecuritate sau neconformitate făcute de șefii locurilor de muncă, centralizate de serviciul intern sau extern de prevenire și protecție, vor fi prezentate periodic (lunar sau trimestrial) în sinteza Directorului General și în funcție de importanța încălcării, imediat ce ia la cunoștință despre aceasta.</w:t>
+        <w:t xml:space="preserve">Constatările de insecuritate sau neconformitate făcute de șefii locurilor de muncă, centralizate de serviciul intern sau extern de prevenire și protecție, vor fi prezentate angajatorului periodic (lunar sau trimestrial), într-o sinteză, și, în funcție de importanța încălcării, imediat ce ia cunoștință de aceasta.</w:t>
       </w:r>
     </w:p>
     <w:p>
@@ -1877,7 +1877,7 @@
           <w:szCs w:val="20"/>
           <w:lang w:val="ro-RO"/>
         </w:rPr>
-        <w:t xml:space="preserve">Neconformitățile constatate vor fi analizate în cadrul ședințelor Comitetului de securitate și sănătate în muncă, acolo unde acesta este constituit, sau de către angajator, iar măsurile de prevenire și protecție vor fi hotărâte de către Directorul General, prin consultare cu membrii Comitetului de securitate și sănătate în muncă, acolo unde acesta este constituit, și cu șefii locurilor de muncă.</w:t>
+        <w:t xml:space="preserve">Neconformitățile constatate vor fi analizate în cadrul ședințelor Comitetului de securitate și sănătate în muncă, acolo unde acesta este constituit, sau de către angajator, iar măsurile de prevenire și protecție vor fi hotărâte de către angajator, prin consultare cu membrii Comitetului de securitate și sănătate în muncă, acolo unde acesta este constituit, și cu șefii locurilor de muncă.</w:t>
       </w:r>
     </w:p>
     <w:p>

</xml_diff>

<commit_message>
fix(templates): the control regulation gets its own document code, R.I.C.P. SSM
It shared "M.I. SSM" with the employer briefing. The code is printed in 12's header box and in
the briefing's list of handed-over documents; the briefing keeps M.I. SSM.

Claude-Session: https://claude.ai/code/session_01A9qjCHVH6kcDAEKFiJoShR
</commit_message>
<xml_diff>
--- a/packages/document-engine/templates/12_control_regulation.docx
+++ b/packages/document-engine/templates/12_control_regulation.docx
@@ -6168,7 +6168,7 @@
               <w:szCs w:val="16"/>
               <w:lang w:val="ro-RO"/>
             </w:rPr>
-            <w:t>M.I. SSM</w:t>
+            <w:t xml:space="preserve">R.I.C.P. SSM</w:t>
           </w:r>
         </w:p>
       </w:tc>
@@ -6951,7 +6951,7 @@
               <w:szCs w:val="16"/>
               <w:lang w:val="ro-RO"/>
             </w:rPr>
-            <w:t>M.I. SSM</w:t>
+            <w:t xml:space="preserve">R.I.C.P. SSM</w:t>
           </w:r>
         </w:p>
       </w:tc>
@@ -7734,7 +7734,7 @@
               <w:szCs w:val="16"/>
               <w:lang w:val="ro-RO"/>
             </w:rPr>
-            <w:t>M.I. SSM</w:t>
+            <w:t xml:space="preserve">R.I.C.P. SSM</w:t>
           </w:r>
         </w:p>
       </w:tc>

</xml_diff>

<commit_message>
fix(templates): the control regulation drops Art. 19, the same list as Art. 16
Both printed the same ten checks a)-j) word for word; Art. 16 ("Serviciul intern sau extern…")
stays. The articles after it move up by one; nothing in the regulation cites them by number.

Claude-Session: https://claude.ai/code/session_01A9qjCHVH6kcDAEKFiJoShR
</commit_message>
<xml_diff>
--- a/packages/document-engine/templates/12_control_regulation.docx
+++ b/packages/document-engine/templates/12_control_regulation.docx
@@ -1518,315 +1518,6 @@
     <w:p>
       <w:pPr>
         <w:pStyle w:val="Normal"/>
-        <w:keepNext/>
-        <w:widowControl/>
-        <w:numPr>
-          <w:ilvl w:val="0"/>
-          <w:numId w:val="7"/>
-        </w:numPr>
-        <w:spacing w:before="120" w:after="60"/>
-        <w:jc w:val="left"/>
-        <w:rPr>
-          <w:rFonts w:ascii="Arial" w:hAnsi="Arial" w:cs="Arial"/>
-          <w:lang w:val="ro-RO"/>
-        </w:rPr>
-      </w:pPr>
-      <w:r>
-        <w:rPr>
-          <w:rFonts w:eastAsia="Arial" w:cs="Arial" w:ascii="Arial" w:hAnsi="Arial"/>
-          <w:color w:val="auto"/>
-          <w:spacing w:val="0"/>
-          <w:w w:val="100"/>
-          <w:sz w:val="20"/>
-          <w:szCs w:val="20"/>
-          <w:lang w:val="ro-RO"/>
-        </w:rPr>
-        <w:t>Serviciul extern de prevenire și protecție va efectua controale de verificare internă, controale prin care se verifică:</w:t>
-      </w:r>
-    </w:p>
-    <w:p>
-      <w:pPr>
-        <w:pStyle w:val="Normal"/>
-        <w:widowControl/>
-        <w:numPr>
-          <w:ilvl w:val="0"/>
-          <w:numId w:val="3"/>
-        </w:numPr>
-        <w:spacing w:before="0" w:after="40"/>
-        <w:jc w:val="left"/>
-        <w:rPr>
-          <w:rFonts w:ascii="Arial" w:hAnsi="Arial" w:cs="Arial"/>
-          <w:lang w:val="fr-FR"/>
-        </w:rPr>
-      </w:pPr>
-      <w:r>
-        <w:rPr>
-          <w:rFonts w:eastAsia="Arial" w:cs="Arial" w:ascii="Arial" w:hAnsi="Arial"/>
-          <w:color w:val="auto"/>
-          <w:spacing w:val="0"/>
-          <w:w w:val="100"/>
-          <w:sz w:val="20"/>
-          <w:szCs w:val="20"/>
-          <w:lang w:val="ro-RO"/>
-        </w:rPr>
-        <w:t>respectarea măsurilor de prevenire și protecție și a cerințelor minime în domeniul S.S.M. (conform cu tematicile de control);</w:t>
-      </w:r>
-    </w:p>
-    <w:p>
-      <w:pPr>
-        <w:pStyle w:val="Normal"/>
-        <w:widowControl/>
-        <w:numPr>
-          <w:ilvl w:val="0"/>
-          <w:numId w:val="3"/>
-        </w:numPr>
-        <w:spacing w:before="0" w:after="40"/>
-        <w:jc w:val="left"/>
-        <w:rPr>
-          <w:rFonts w:ascii="Arial" w:hAnsi="Arial" w:cs="Arial"/>
-          <w:lang w:val="fr-FR"/>
-        </w:rPr>
-      </w:pPr>
-      <w:r>
-        <w:rPr>
-          <w:rFonts w:eastAsia="Arial" w:cs="Arial" w:ascii="Arial" w:hAnsi="Arial"/>
-          <w:color w:val="auto"/>
-          <w:spacing w:val="0"/>
-          <w:w w:val="100"/>
-          <w:sz w:val="20"/>
-          <w:szCs w:val="20"/>
-          <w:lang w:val="ro-RO"/>
-        </w:rPr>
-        <w:t xml:space="preserve">respectarea măsurilor de prevenire și protecție și a cerințelor minime în domeniul ISCIR și AMC conform prevederilor art. 15 din H.G. 1425/ 2006, modificată și completată;</w:t>
-      </w:r>
-    </w:p>
-    <w:p>
-      <w:pPr>
-        <w:pStyle w:val="Normal"/>
-        <w:widowControl/>
-        <w:numPr>
-          <w:ilvl w:val="0"/>
-          <w:numId w:val="3"/>
-        </w:numPr>
-        <w:spacing w:before="0" w:after="40"/>
-        <w:jc w:val="left"/>
-        <w:rPr>
-          <w:rFonts w:ascii="Arial" w:hAnsi="Arial" w:cs="Arial"/>
-          <w:lang w:val="fr-FR"/>
-        </w:rPr>
-      </w:pPr>
-      <w:r>
-        <w:rPr>
-          <w:rFonts w:eastAsia="Arial" w:cs="Arial" w:ascii="Arial" w:hAnsi="Arial"/>
-          <w:color w:val="auto"/>
-          <w:spacing w:val="0"/>
-          <w:w w:val="100"/>
-          <w:sz w:val="20"/>
-          <w:szCs w:val="20"/>
-          <w:lang w:val="ro-RO"/>
-        </w:rPr>
-        <w:t>situația măsurilor propuse în referatele anterioare și termenele de rezolvare (dacă au fost luate măsuri de remediere);</w:t>
-      </w:r>
-    </w:p>
-    <w:p>
-      <w:pPr>
-        <w:pStyle w:val="Normal"/>
-        <w:widowControl/>
-        <w:numPr>
-          <w:ilvl w:val="0"/>
-          <w:numId w:val="3"/>
-        </w:numPr>
-        <w:spacing w:before="0" w:after="40"/>
-        <w:jc w:val="left"/>
-        <w:rPr>
-          <w:rFonts w:ascii="Arial" w:hAnsi="Arial" w:cs="Arial"/>
-          <w:lang w:val="fr-FR"/>
-        </w:rPr>
-      </w:pPr>
-      <w:r>
-        <w:rPr>
-          <w:rFonts w:eastAsia="Arial" w:cs="Arial" w:ascii="Arial" w:hAnsi="Arial"/>
-          <w:color w:val="auto"/>
-          <w:spacing w:val="0"/>
-          <w:w w:val="100"/>
-          <w:sz w:val="20"/>
-          <w:szCs w:val="20"/>
-          <w:lang w:val="ro-RO"/>
-        </w:rPr>
-        <w:t>modul de efectuare al sarcinilor de serviciu de către lucrători cu privire la instrucțiunile proprii de securitate și sănătate în muncă;</w:t>
-      </w:r>
-    </w:p>
-    <w:p>
-      <w:pPr>
-        <w:pStyle w:val="Normal"/>
-        <w:widowControl/>
-        <w:numPr>
-          <w:ilvl w:val="0"/>
-          <w:numId w:val="3"/>
-        </w:numPr>
-        <w:spacing w:before="0" w:after="40"/>
-        <w:jc w:val="left"/>
-        <w:rPr>
-          <w:rFonts w:ascii="Arial" w:hAnsi="Arial" w:cs="Arial"/>
-          <w:lang w:val="fr-FR"/>
-        </w:rPr>
-      </w:pPr>
-      <w:r>
-        <w:rPr>
-          <w:rFonts w:eastAsia="Arial" w:cs="Arial" w:ascii="Arial" w:hAnsi="Arial"/>
-          <w:color w:val="auto"/>
-          <w:spacing w:val="0"/>
-          <w:w w:val="100"/>
-          <w:sz w:val="20"/>
-          <w:szCs w:val="20"/>
-          <w:lang w:val="ro-RO"/>
-        </w:rPr>
-        <w:t>situația amplasării mijloacelor de semnalizare;</w:t>
-      </w:r>
-    </w:p>
-    <w:p>
-      <w:pPr>
-        <w:pStyle w:val="Normal"/>
-        <w:widowControl/>
-        <w:numPr>
-          <w:ilvl w:val="0"/>
-          <w:numId w:val="3"/>
-        </w:numPr>
-        <w:spacing w:before="0" w:after="40"/>
-        <w:jc w:val="left"/>
-        <w:rPr>
-          <w:rFonts w:ascii="Arial" w:hAnsi="Arial" w:cs="Arial"/>
-          <w:lang w:val="fr-FR"/>
-        </w:rPr>
-      </w:pPr>
-      <w:r>
-        <w:rPr>
-          <w:rFonts w:eastAsia="Arial" w:cs="Arial" w:ascii="Arial" w:hAnsi="Arial"/>
-          <w:color w:val="auto"/>
-          <w:spacing w:val="0"/>
-          <w:w w:val="100"/>
-          <w:sz w:val="20"/>
-          <w:szCs w:val="20"/>
-          <w:lang w:val="ro-RO"/>
-        </w:rPr>
-        <w:t>deficiențe care se manifestă în domeniul securității și sănătății în muncă;</w:t>
-      </w:r>
-    </w:p>
-    <w:p>
-      <w:pPr>
-        <w:pStyle w:val="Normal"/>
-        <w:widowControl/>
-        <w:numPr>
-          <w:ilvl w:val="0"/>
-          <w:numId w:val="3"/>
-        </w:numPr>
-        <w:spacing w:before="0" w:after="40"/>
-        <w:jc w:val="left"/>
-        <w:rPr>
-          <w:rFonts w:ascii="Arial" w:hAnsi="Arial" w:cs="Arial"/>
-          <w:lang w:val="fr-FR"/>
-        </w:rPr>
-      </w:pPr>
-      <w:r>
-        <w:rPr>
-          <w:rFonts w:eastAsia="Arial" w:cs="Arial" w:ascii="Arial" w:hAnsi="Arial"/>
-          <w:color w:val="auto"/>
-          <w:spacing w:val="0"/>
-          <w:w w:val="100"/>
-          <w:sz w:val="20"/>
-          <w:szCs w:val="20"/>
-          <w:lang w:val="ro-RO"/>
-        </w:rPr>
-        <w:t>relațiile cu terții privind securitatea și sănătatea în muncă;</w:t>
-      </w:r>
-    </w:p>
-    <w:p>
-      <w:pPr>
-        <w:pStyle w:val="Normal"/>
-        <w:widowControl/>
-        <w:numPr>
-          <w:ilvl w:val="0"/>
-          <w:numId w:val="3"/>
-        </w:numPr>
-        <w:spacing w:before="0" w:after="40"/>
-        <w:jc w:val="left"/>
-        <w:rPr>
-          <w:rFonts w:ascii="Arial" w:hAnsi="Arial" w:cs="Arial"/>
-          <w:lang w:val="fr-FR"/>
-        </w:rPr>
-      </w:pPr>
-      <w:r>
-        <w:rPr>
-          <w:rFonts w:eastAsia="Arial" w:cs="Arial" w:ascii="Arial" w:hAnsi="Arial"/>
-          <w:color w:val="auto"/>
-          <w:spacing w:val="0"/>
-          <w:w w:val="100"/>
-          <w:sz w:val="20"/>
-          <w:szCs w:val="20"/>
-          <w:lang w:val="ro-RO"/>
-        </w:rPr>
-        <w:t>verificările periodice la mijloacele de muncă;</w:t>
-      </w:r>
-    </w:p>
-    <w:p>
-      <w:pPr>
-        <w:pStyle w:val="Normal"/>
-        <w:widowControl/>
-        <w:numPr>
-          <w:ilvl w:val="0"/>
-          <w:numId w:val="3"/>
-        </w:numPr>
-        <w:spacing w:before="0" w:after="40"/>
-        <w:jc w:val="left"/>
-        <w:rPr>
-          <w:rFonts w:ascii="Arial" w:hAnsi="Arial" w:cs="Arial"/>
-          <w:lang w:val="fr-FR"/>
-        </w:rPr>
-      </w:pPr>
-      <w:r>
-        <w:rPr>
-          <w:rFonts w:eastAsia="Arial" w:cs="Arial" w:ascii="Arial" w:hAnsi="Arial"/>
-          <w:color w:val="auto"/>
-          <w:spacing w:val="0"/>
-          <w:w w:val="100"/>
-          <w:sz w:val="20"/>
-          <w:szCs w:val="20"/>
-          <w:lang w:val="ro-RO"/>
-        </w:rPr>
-        <w:t>eficiența activităților desfășurate avându-se în vedere activitatea de prevenire și protecție;</w:t>
-      </w:r>
-    </w:p>
-    <w:p>
-      <w:pPr>
-        <w:pStyle w:val="Normal"/>
-        <w:widowControl/>
-        <w:numPr>
-          <w:ilvl w:val="0"/>
-          <w:numId w:val="3"/>
-        </w:numPr>
-        <w:spacing w:before="0" w:after="120"/>
-        <w:jc w:val="left"/>
-        <w:rPr>
-          <w:rFonts w:ascii="Arial" w:hAnsi="Arial" w:cs="Arial"/>
-          <w:lang w:val="fr-FR"/>
-        </w:rPr>
-      </w:pPr>
-      <w:r>
-        <w:rPr>
-          <w:rFonts w:eastAsia="Arial" w:cs="Arial" w:ascii="Arial" w:hAnsi="Arial"/>
-          <w:color w:val="auto"/>
-          <w:spacing w:val="0"/>
-          <w:w w:val="100"/>
-          <w:sz w:val="20"/>
-          <w:szCs w:val="20"/>
-          <w:lang w:val="ro-RO"/>
-        </w:rPr>
-        <w:t>propuneri de sancțiuni și stimulente pentru lucrători pe criteriul îndeplinirii atribuțiilor în domeniul securității și sănătății în muncă.</w:t>
-      </w:r>
-    </w:p>
-    <w:p>
-      <w:pPr>
-        <w:pStyle w:val="Normal"/>
         <w:widowControl/>
         <w:numPr>
           <w:ilvl w:val="0"/>

</xml_diff>

<commit_message>
fix(templates): the control regulation's Art. 5 and Art. 19 read cleanly
Art. 5 c) reads "și/ sau", the house form, and Art. 19 "va sintetiza
activitatea desfășurată, constatările făcute și acțiunile viitoare".

Claude-Session: https://claude.ai/code/session_01A9qjCHVH6kcDAEKFiJoShR
</commit_message>
<xml_diff>
--- a/packages/document-engine/templates/12_control_regulation.docx
+++ b/packages/document-engine/templates/12_control_regulation.docx
@@ -610,7 +610,7 @@
           <w:szCs w:val="20"/>
           <w:lang w:val="ro-RO"/>
         </w:rPr>
-        <w:t xml:space="preserve">șefii locurilor de muncă vor efectua controale interne săptămânale vizuale la locurile de muncă pe care le conduc și în zona în care își desfășoară activitatea și vor transmite neregulile constatate către șeful ierarhic superior și / sau către angajator sau persoana desemnată de acesta.</w:t>
+        <w:t xml:space="preserve">șefii locurilor de muncă vor efectua controale interne săptămânale vizuale la locurile de muncă pe care le conduc și în zona în care își desfășoară activitatea și vor transmite neregulile constatate către șeful ierarhic superior și/ sau către angajator sau persoana desemnată de acesta.</w:t>
       </w:r>
     </w:p>
     <w:p>
@@ -1540,7 +1540,7 @@
           <w:szCs w:val="20"/>
           <w:lang w:val="ro-RO"/>
         </w:rPr>
-        <w:t>Serviciul extern de prevenire și protecție va prezenta TRIMESTRIAL un raport de activitate prin care va sintetiza activitatea desfășurată, constatări făcute și acțiuni viitoare.</w:t>
+        <w:t xml:space="preserve">Serviciul extern de prevenire și protecție va prezenta TRIMESTRIAL un raport de activitate prin care va sintetiza activitatea desfășurată, constatările făcute și acțiunile viitoare.</w:t>
       </w:r>
     </w:p>
     <w:p>

</xml_diff>

<commit_message>
fix(templates): the control regulation's "modul de … a" agreement
"modul de funcționare a mijloacelor", "modul de efectuare a sarcinilor",
"modul de rezolvare a măsurilor": the genitive goes with the verbal noun.

Claude-Session: https://claude.ai/code/session_01A9qjCHVH6kcDAEKFiJoShR
</commit_message>
<xml_diff>
--- a/packages/document-engine/templates/12_control_regulation.docx
+++ b/packages/document-engine/templates/12_control_regulation.docx
@@ -923,7 +923,7 @@
           <w:szCs w:val="20"/>
           <w:lang w:val="ro-RO"/>
         </w:rPr>
-        <w:t>Verificări cu privire la starea mijloacelor de muncă și modul de funcționare al mijloacelor de muncă (dacă există protecțiile montate, dacă există probleme de funcționare, dacă sistemele de securitate funcționează).</w:t>
+        <w:t xml:space="preserve">Verificări cu privire la starea mijloacelor de muncă și modul de funcționare a mijloacelor de muncă (dacă există protecțiile montate, dacă există probleme de funcționare, dacă sistemele de securitate funcționează).</w:t>
       </w:r>
     </w:p>
     <w:p>
@@ -1288,7 +1288,7 @@
           <w:szCs w:val="20"/>
           <w:lang w:val="ro-RO"/>
         </w:rPr>
-        <w:t>modul de efectuare al sarcinilor de serviciu de către lucrători cu privire la instrucțiunile proprii de securitate și sănătate în muncă;</w:t>
+        <w:t xml:space="preserve">modul de efectuare a sarcinilor de serviciu de către lucrători cu privire la instrucțiunile proprii de securitate și sănătate în muncă;</w:t>
       </w:r>
     </w:p>
     <w:p>
@@ -1600,7 +1600,7 @@
           <w:szCs w:val="20"/>
           <w:lang w:val="ro-RO"/>
         </w:rPr>
-        <w:t>Măsurile de prevenire și protecție vor fi aduse la cunoștința persoanelor care au legătură cu modul de rezolvare al măsurilor dispuse.</w:t>
+        <w:t xml:space="preserve">Măsurile de prevenire și protecție vor fi aduse la cunoștința persoanelor care au legătură cu modul de rezolvare a măsurilor dispuse.</w:t>
       </w:r>
     </w:p>
     <w:p>

</xml_diff>